<commit_message>
Fix paired-field spacing that never actually applied
twoField set its "after" gap on the table's own margins, but every cell
inside it also declared its own margins — top and bottom zero — and a
cell's own margin always wins over the table's default. So the gap passed
in was silently dropped everywhere twoField is used: CT-01, CT-02, CT-03
and CT-04 all had their paired lines running straight into whatever came
next, no matter what value was asked for.

The gap now lives on each cell's own bottom margin instead, where it
actually takes effect. Regenerated the blank templates in
public/templates to match.

Co-Authored-By: Claude Sonnet 5 <noreply@anthropic.com>
</commit_message>
<xml_diff>
--- a/public/templates/CT01_Phieu-thong-tin-tuyen-dung_mau-trang.docx
+++ b/public/templates/CT01_Phieu-thong-tin-tuyen-dung_mau-trang.docx
@@ -87,9 +87,6 @@
           <w:insideH w:val="none" w:color="FFFFFF" w:sz="0"/>
           <w:insideV w:val="none" w:color="FFFFFF" w:sz="0"/>
         </w:tblBorders>
-        <w:tblCellMar>
-          <w:bottom w:type="dxa" w:w="50"/>
-        </w:tblCellMar>
       </w:tblPr>
       <w:tblGrid>
         <w:gridCol w:w="4680"/>
@@ -105,7 +102,7 @@
             <w:tcMar>
               <w:top w:type="dxa" w:w="0"/>
               <w:left w:type="dxa" w:w="0"/>
-              <w:bottom w:type="dxa" w:w="0"/>
+              <w:bottom w:type="dxa" w:w="50"/>
               <w:right w:type="dxa" w:w="160"/>
             </w:tcMar>
           </w:tcPr>
@@ -130,7 +127,7 @@
             <w:tcMar>
               <w:top w:type="dxa" w:w="0"/>
               <w:left w:type="dxa" w:w="0"/>
-              <w:bottom w:type="dxa" w:w="0"/>
+              <w:bottom w:type="dxa" w:w="50"/>
               <w:right w:type="dxa" w:w="0"/>
             </w:tcMar>
           </w:tcPr>
@@ -162,9 +159,6 @@
           <w:insideH w:val="none" w:color="FFFFFF" w:sz="0"/>
           <w:insideV w:val="none" w:color="FFFFFF" w:sz="0"/>
         </w:tblBorders>
-        <w:tblCellMar>
-          <w:bottom w:type="dxa" w:w="50"/>
-        </w:tblCellMar>
       </w:tblPr>
       <w:tblGrid>
         <w:gridCol w:w="4680"/>
@@ -180,7 +174,7 @@
             <w:tcMar>
               <w:top w:type="dxa" w:w="0"/>
               <w:left w:type="dxa" w:w="0"/>
-              <w:bottom w:type="dxa" w:w="0"/>
+              <w:bottom w:type="dxa" w:w="50"/>
               <w:right w:type="dxa" w:w="160"/>
             </w:tcMar>
           </w:tcPr>
@@ -205,7 +199,7 @@
             <w:tcMar>
               <w:top w:type="dxa" w:w="0"/>
               <w:left w:type="dxa" w:w="0"/>
-              <w:bottom w:type="dxa" w:w="0"/>
+              <w:bottom w:type="dxa" w:w="50"/>
               <w:right w:type="dxa" w:w="0"/>
             </w:tcMar>
           </w:tcPr>
@@ -237,9 +231,6 @@
           <w:insideH w:val="none" w:color="FFFFFF" w:sz="0"/>
           <w:insideV w:val="none" w:color="FFFFFF" w:sz="0"/>
         </w:tblBorders>
-        <w:tblCellMar>
-          <w:bottom w:type="dxa" w:w="50"/>
-        </w:tblCellMar>
       </w:tblPr>
       <w:tblGrid>
         <w:gridCol w:w="4680"/>
@@ -255,7 +246,7 @@
             <w:tcMar>
               <w:top w:type="dxa" w:w="0"/>
               <w:left w:type="dxa" w:w="0"/>
-              <w:bottom w:type="dxa" w:w="0"/>
+              <w:bottom w:type="dxa" w:w="50"/>
               <w:right w:type="dxa" w:w="160"/>
             </w:tcMar>
           </w:tcPr>
@@ -280,7 +271,7 @@
             <w:tcMar>
               <w:top w:type="dxa" w:w="0"/>
               <w:left w:type="dxa" w:w="0"/>
-              <w:bottom w:type="dxa" w:w="0"/>
+              <w:bottom w:type="dxa" w:w="50"/>
               <w:right w:type="dxa" w:w="0"/>
             </w:tcMar>
           </w:tcPr>
@@ -629,9 +620,6 @@
           <w:insideH w:val="none" w:color="FFFFFF" w:sz="0"/>
           <w:insideV w:val="none" w:color="FFFFFF" w:sz="0"/>
         </w:tblBorders>
-        <w:tblCellMar>
-          <w:bottom w:type="dxa" w:w="50"/>
-        </w:tblCellMar>
       </w:tblPr>
       <w:tblGrid>
         <w:gridCol w:w="4680"/>
@@ -647,7 +635,7 @@
             <w:tcMar>
               <w:top w:type="dxa" w:w="0"/>
               <w:left w:type="dxa" w:w="0"/>
-              <w:bottom w:type="dxa" w:w="0"/>
+              <w:bottom w:type="dxa" w:w="50"/>
               <w:right w:type="dxa" w:w="160"/>
             </w:tcMar>
           </w:tcPr>
@@ -672,7 +660,7 @@
             <w:tcMar>
               <w:top w:type="dxa" w:w="0"/>
               <w:left w:type="dxa" w:w="0"/>
-              <w:bottom w:type="dxa" w:w="0"/>
+              <w:bottom w:type="dxa" w:w="50"/>
               <w:right w:type="dxa" w:w="0"/>
             </w:tcMar>
           </w:tcPr>

</xml_diff>

<commit_message>
Stop collecting relatives working at MVI
The question, the relative table and the undertaking that went with it are
gone from the online form, the printed CT-01, the schema and the
spreadsheet export; section 2 now runs from the work history straight into
section 3. Blank templates regenerated to match.

Two things this leaves open. Legal's comment 181 asked for the undertaking
to be added, not for the question to go, and their reviewed CT-01 still
carries it — the Word file and Legal both need telling. And the relative
names and ID numbers already submitted stay in Firestore; they are no
longer shown or exported, but nothing has deleted them.

Co-Authored-By: Claude Opus 5 <noreply@anthropic.com>
</commit_message>
<xml_diff>
--- a/public/templates/CT01_Phieu-thong-tin-tuyen-dung_mau-trang.docx
+++ b/public/templates/CT01_Phieu-thong-tin-tuyen-dung_mau-trang.docx
@@ -1028,20 +1028,78 @@
         <w:t xml:space="preserve">Có</w:t>
       </w:r>
     </w:p>
-    <w:p>
-      <w:pPr>
-        <w:tabs>
-          <w:tab w:val="right" w:pos="9300" w:leader="dot"/>
-        </w:tabs>
-        <w:spacing w:after="50" w:line="240" w:lineRule="auto"/>
-      </w:pPr>
-      <w:r>
-        <w:t xml:space="preserve">Số lượng khách hàng tiềm năng: </w:t>
-      </w:r>
-      <w:r>
-        <w:t xml:space="preserve">	</w:t>
-      </w:r>
-    </w:p>
+    <w:tbl>
+      <w:tblPr>
+        <w:tblW w:type="dxa" w:w="9360"/>
+        <w:tblBorders>
+          <w:top w:val="none" w:color="FFFFFF" w:sz="0"/>
+          <w:left w:val="none" w:color="FFFFFF" w:sz="0"/>
+          <w:bottom w:val="none" w:color="FFFFFF" w:sz="0"/>
+          <w:right w:val="none" w:color="FFFFFF" w:sz="0"/>
+          <w:insideH w:val="none" w:color="FFFFFF" w:sz="0"/>
+          <w:insideV w:val="none" w:color="FFFFFF" w:sz="0"/>
+        </w:tblBorders>
+      </w:tblPr>
+      <w:tblGrid>
+        <w:gridCol w:w="4680"/>
+        <w:gridCol w:w="4680"/>
+      </w:tblGrid>
+      <w:tr>
+        <w:trPr>
+          <w:cantSplit/>
+        </w:trPr>
+        <w:tc>
+          <w:tcPr>
+            <w:tcW w:type="dxa" w:w="4680"/>
+            <w:tcMar>
+              <w:top w:type="dxa" w:w="0"/>
+              <w:left w:type="dxa" w:w="0"/>
+              <w:bottom w:type="dxa" w:w="50"/>
+              <w:right w:type="dxa" w:w="160"/>
+            </w:tcMar>
+          </w:tcPr>
+          <w:p>
+            <w:pPr>
+              <w:tabs>
+                <w:tab w:val="right" w:pos="4460" w:leader="dot"/>
+              </w:tabs>
+              <w:spacing w:after="0" w:line="240" w:lineRule="auto"/>
+            </w:pPr>
+            <w:r>
+              <w:t xml:space="preserve">Số lượng khách hàng tiềm năng: </w:t>
+            </w:r>
+            <w:r>
+              <w:t xml:space="preserve">	</w:t>
+            </w:r>
+          </w:p>
+        </w:tc>
+        <w:tc>
+          <w:tcPr>
+            <w:tcW w:type="dxa" w:w="4680"/>
+            <w:tcMar>
+              <w:top w:type="dxa" w:w="0"/>
+              <w:left w:type="dxa" w:w="0"/>
+              <w:bottom w:type="dxa" w:w="50"/>
+              <w:right w:type="dxa" w:w="0"/>
+            </w:tcMar>
+          </w:tcPr>
+          <w:p>
+            <w:pPr>
+              <w:tabs>
+                <w:tab w:val="right" w:pos="4620" w:leader="dot"/>
+              </w:tabs>
+              <w:spacing w:after="0" w:line="240" w:lineRule="auto"/>
+            </w:pPr>
+            <w:r>
+              <w:t xml:space="preserve">Ngày khai giảng: </w:t>
+            </w:r>
+            <w:r>
+              <w:t xml:space="preserve">	</w:t>
+            </w:r>
+          </w:p>
+        </w:tc>
+      </w:tr>
+    </w:tbl>
     <w:p>
       <w:pPr>
         <w:keepNext/>
@@ -1367,45 +1425,6 @@
         </w:tc>
       </w:tr>
     </w:tbl>
-    <w:p>
-      <w:pPr>
-        <w:keepNext/>
-        <w:spacing w:after="40" w:line="240" w:lineRule="auto"/>
-      </w:pPr>
-      <w:r>
-        <w:rPr>
-          <w:b/>
-          <w:bCs/>
-        </w:rPr>
-        <w:t xml:space="preserve">Anh/Chị có người thân làm việc tại MVI không?</w:t>
-      </w:r>
-    </w:p>
-    <w:p>
-      <w:pPr>
-        <w:spacing w:after="50" w:line="240" w:lineRule="auto"/>
-      </w:pPr>
-      <w:r>
-        <w:rPr>
-          <w:rFonts w:ascii="Segoe UI Symbol" w:cs="Segoe UI Symbol" w:eastAsia="Segoe UI Symbol" w:hAnsi="Segoe UI Symbol"/>
-        </w:rPr>
-        <w:t xml:space="preserve">☐ </w:t>
-      </w:r>
-      <w:r>
-        <w:t xml:space="preserve">Không</w:t>
-      </w:r>
-      <w:r>
-        <w:t xml:space="preserve">      </w:t>
-      </w:r>
-      <w:r>
-        <w:rPr>
-          <w:rFonts w:ascii="Segoe UI Symbol" w:cs="Segoe UI Symbol" w:eastAsia="Segoe UI Symbol" w:hAnsi="Segoe UI Symbol"/>
-        </w:rPr>
-        <w:t xml:space="preserve">☐ </w:t>
-      </w:r>
-      <w:r>
-        <w:t xml:space="preserve">Có</w:t>
-      </w:r>
-    </w:p>
     <w:p>
       <w:pPr>
         <w:keepNext/>

</xml_diff>

<commit_message>
Let the candidate declare what they are signing
The manager's box says what they attested to; the candidate's said
nothing at all. Both blank templates and the filled export carry it now.

Co-Authored-By: Claude Opus 5 <noreply@anthropic.com>
</commit_message>
<xml_diff>
--- a/public/templates/CT01_Phieu-thong-tin-tuyen-dung_mau-trang.docx
+++ b/public/templates/CT01_Phieu-thong-tin-tuyen-dung_mau-trang.docx
@@ -1456,7 +1456,7 @@
         <w:t xml:space="preserve">☐ </w:t>
       </w:r>
       <w:r>
-        <w:t xml:space="preserve">Tôi cam kết toàn bộ thông tin, tài liệu và dữ liệu cá nhân mà tôi cung cấp cho Công ty tại văn bản này và trong suốt quá trình làm việc là đầy đủ, chính xác và trung thực. Tôi hoàn toàn chịu trách nhiệm trước Công ty và trước pháp luật đối với mọi hậu quả phát sinh nếu thông tin tôi cung cấp là sai sự thật, giả mạo hoặc gây hiểu nhầm, kể cả trong trường hợp Công ty đã căn cứ vào thông tin đó để thẩm định hồ sơ, cấp Mã số đại lý hoặc thực hiện các quyền lợi liên quan.</w:t>
+        <w:t xml:space="preserve">Tôi cam kết toàn bộ thông tin, tài liệu và dữ liệu cá nhân mà tôi cung cấp cho Công ty tại văn bản này và trong suốt quá trình hợp tác là đầy đủ, chính xác, trung thực và còn hiệu lực tại thời điểm cung cấp. Tôi hoàn toàn chịu trách nhiệm trước Công ty và trước pháp luật đối với mọi hậu quả phát sinh nếu thông tin tôi cung cấp là sai sự thật, giả mạo hoặc gây hiểu nhầm, kể cả trong trường hợp Công ty đã căn cứ vào thông tin đó để thẩm định hồ sơ, cấp Mã số đại lý hoặc thực hiện các quyền lợi liên quan.</w:t>
       </w:r>
     </w:p>
     <w:p>
@@ -1873,7 +1873,7 @@
           <w:p>
             <w:pPr>
               <w:keepNext/>
-              <w:spacing w:after="0" w:line="240" w:lineRule="auto"/>
+              <w:spacing w:after="60" w:line="240" w:lineRule="auto"/>
               <w:jc w:val="center"/>
             </w:pPr>
             <w:r>
@@ -1883,6 +1883,20 @@
                 <w:color w:val="1F3864"/>
               </w:rPr>
               <w:t xml:space="preserve">ỨNG VIÊN</w:t>
+            </w:r>
+          </w:p>
+          <w:p>
+            <w:pPr>
+              <w:spacing w:line="240" w:lineRule="auto"/>
+              <w:jc w:val="both"/>
+            </w:pPr>
+            <w:r>
+              <w:rPr>
+                <w:i/>
+                <w:iCs/>
+                <w:color w:val="1F3864"/>
+              </w:rPr>
+              <w:t xml:space="preserve">Tôi xác nhận đã đọc, hiểu rõ và đồng ý với toàn bộ nội dung của Phiếu này, bao gồm các cam kết và nội dung đồng ý xử lý dữ liệu cá nhân nêu trên.</w:t>
             </w:r>
           </w:p>
         </w:tc>

</xml_diff>